<commit_message>
Button + text added
</commit_message>
<xml_diff>
--- a/Project Brief Doc.docx
+++ b/Project Brief Doc.docx
@@ -3,6 +3,9 @@
 <w:document xmlns:wpc="http://schemas.microsoft.com/office/word/2010/wordprocessingCanvas" xmlns:cx="http://schemas.microsoft.com/office/drawing/2014/chartex" xmlns:cx1="http://schemas.microsoft.com/office/drawing/2015/9/8/chartex" xmlns:cx2="http://schemas.microsoft.com/office/drawing/2015/10/21/chartex" xmlns:cx3="http://schemas.microsoft.com/office/drawing/2016/5/9/chartex" xmlns:cx4="http://schemas.microsoft.com/office/drawing/2016/5/10/chartex" xmlns:cx5="http://schemas.microsoft.com/office/drawing/2016/5/11/chartex" xmlns:cx6="http://schemas.microsoft.com/office/drawing/2016/5/12/chartex" xmlns:cx7="http://schemas.microsoft.com/office/drawing/2016/5/13/chartex" xmlns:cx8="http://schemas.microsoft.com/office/drawing/2016/5/14/chartex" xmlns:mc="http://schemas.openxmlformats.org/markup-compatibility/2006" xmlns:aink="http://schemas.microsoft.com/office/drawing/2016/ink" xmlns:am3d="http://schemas.microsoft.com/office/drawing/2017/model3d" xmlns:o="urn:schemas-microsoft-com:office:office" xmlns:oel="http://schemas.microsoft.com/office/2019/extlst" xmlns:r="http://schemas.openxmlformats.org/officeDocument/2006/relationships" xmlns:m="http://schemas.openxmlformats.org/officeDocument/2006/math" xmlns:v="urn:schemas-microsoft-com:vml" xmlns:wp14="http://schemas.microsoft.com/office/word/2010/wordprocessingDrawing" xmlns:wp="http://schemas.openxmlformats.org/drawingml/2006/wordprocessingDrawing" xmlns:w10="urn:schemas-microsoft-com:office:word" xmlns:w="http://schemas.openxmlformats.org/wordprocessingml/2006/main" xmlns:w14="http://schemas.microsoft.com/office/word/2010/wordml" xmlns:w15="http://schemas.microsoft.com/office/word/2012/wordml" xmlns:w16cex="http://schemas.microsoft.com/office/word/2018/wordml/cex" xmlns:w16cid="http://schemas.microsoft.com/office/word/2016/wordml/cid" xmlns:w16="http://schemas.microsoft.com/office/word/2018/wordml" xmlns:w16du="http://schemas.microsoft.com/office/word/2023/wordml/word16du" xmlns:w16sdtdh="http://schemas.microsoft.com/office/word/2020/wordml/sdtdatahash" xmlns:w16sdtfl="http://schemas.microsoft.com/office/word/2024/wordml/sdtformatlock" xmlns:w16se="http://schemas.microsoft.com/office/word/2015/wordml/symex" xmlns:wpg="http://schemas.microsoft.com/office/word/2010/wordprocessingGroup" xmlns:wpi="http://schemas.microsoft.com/office/word/2010/wordprocessingInk" xmlns:wne="http://schemas.microsoft.com/office/word/2006/wordml" xmlns:wps="http://schemas.microsoft.com/office/word/2010/wordprocessingShape" mc:Ignorable="w14 w15 w16se w16cid w16 w16cex w16sdtdh w16sdtfl w16du wp14">
   <w:body>
     <w:p>
+      <w:r>
+        <w:t xml:space="preserve"> </w:t>
+      </w:r>
       <w:r>
         <w:t xml:space="preserve">Topic: </w:t>
       </w:r>
@@ -114,16 +117,6 @@
       <w:r>
         <w:t>Clean portfolio dashboard with sector exposure by percentage</w:t>
       </w:r>
-    </w:p>
-    <w:p>
-      <w:hyperlink r:id="rId5" w:history="1">
-        <w:r>
-          <w:rPr>
-            <w:rStyle w:val="Hyperlink"/>
-          </w:rPr>
-          <w:t>https://www.figma.com/make/DsBcsbG96y2TW2J4hgVnID/Stock-research-app?t=hVCeLNTpkXmkmuug-1</w:t>
-        </w:r>
-      </w:hyperlink>
     </w:p>
     <w:p>
       <w:r>
@@ -148,7 +141,7 @@
                     </pic:cNvPicPr>
                   </pic:nvPicPr>
                   <pic:blipFill>
-                    <a:blip r:embed="rId6">
+                    <a:blip r:embed="rId5">
                       <a:extLst>
                         <a:ext uri="{28A0092B-C50C-407E-A947-70E740481C1C}">
                           <a14:useLocalDpi xmlns:a14="http://schemas.microsoft.com/office/drawing/2010/main" val="0"/>
@@ -206,13 +199,8 @@
       </w:r>
     </w:p>
     <w:p>
-      <w:proofErr w:type="spellStart"/>
-      <w:r>
-        <w:t>Color</w:t>
-      </w:r>
-      <w:proofErr w:type="spellEnd"/>
-      <w:r>
-        <w:t xml:space="preserve"> = days until next review</w:t>
+      <w:r>
+        <w:t>Color = days until next review</w:t>
       </w:r>
     </w:p>
     <w:p>
@@ -290,7 +278,7 @@
                     <pic:cNvPicPr/>
                   </pic:nvPicPr>
                   <pic:blipFill>
-                    <a:blip r:embed="rId7"/>
+                    <a:blip r:embed="rId6"/>
                     <a:stretch>
                       <a:fillRect/>
                     </a:stretch>
@@ -312,20 +300,12 @@
       </w:r>
     </w:p>
     <w:p>
-      <w:hyperlink r:id="rId8" w:history="1">
-        <w:proofErr w:type="spellStart"/>
+      <w:hyperlink r:id="rId7" w:history="1">
         <w:r>
           <w:rPr>
             <w:rStyle w:val="Hyperlink"/>
           </w:rPr>
-          <w:t>Color</w:t>
-        </w:r>
-        <w:proofErr w:type="spellEnd"/>
-        <w:r>
-          <w:rPr>
-            <w:rStyle w:val="Hyperlink"/>
-          </w:rPr>
-          <w:t xml:space="preserve"> Palette Generator From Image | Adobe Express</w:t>
+          <w:t>Color Palette Generator From Image | Adobe Express</w:t>
         </w:r>
         <w:r>
           <w:rPr>
@@ -337,7 +317,7 @@
       </w:hyperlink>
     </w:p>
     <w:p>
-      <w:hyperlink r:id="rId9" w:history="1">
+      <w:hyperlink r:id="rId8" w:history="1">
         <w:r>
           <w:rPr>
             <w:rStyle w:val="Hyperlink"/>
@@ -369,7 +349,7 @@
                     <pic:cNvPicPr/>
                   </pic:nvPicPr>
                   <pic:blipFill>
-                    <a:blip r:embed="rId10"/>
+                    <a:blip r:embed="rId9"/>
                     <a:stretch>
                       <a:fillRect/>
                     </a:stretch>
@@ -395,23 +375,7 @@
     <w:p>
       <w:r>
         <w:lastRenderedPageBreak/>
-        <w:t xml:space="preserve">Ai animated </w:t>
-      </w:r>
-      <w:proofErr w:type="spellStart"/>
-      <w:r>
-        <w:t>javascript</w:t>
-      </w:r>
-      <w:proofErr w:type="spellEnd"/>
-      <w:r>
-        <w:t xml:space="preserve"> blackhole inspired by the </w:t>
-      </w:r>
-      <w:proofErr w:type="spellStart"/>
-      <w:r>
-        <w:t>tradingview</w:t>
-      </w:r>
-      <w:proofErr w:type="spellEnd"/>
-      <w:r>
-        <w:t xml:space="preserve"> </w:t>
+        <w:t xml:space="preserve">Ai animated javascript blackhole inspired by the tradingview </w:t>
       </w:r>
       <w:r>
         <w:rPr>
@@ -433,7 +397,7 @@
                     <pic:cNvPicPr/>
                   </pic:nvPicPr>
                   <pic:blipFill>
-                    <a:blip r:embed="rId11"/>
+                    <a:blip r:embed="rId10"/>
                     <a:stretch>
                       <a:fillRect/>
                     </a:stretch>
@@ -460,21 +424,13 @@
           <w:noProof/>
         </w:rPr>
       </w:pPr>
-      <w:hyperlink r:id="rId12" w:history="1">
+      <w:hyperlink r:id="rId11" w:history="1">
         <w:r>
           <w:rPr>
             <w:rStyle w:val="Hyperlink"/>
           </w:rPr>
-          <w:t xml:space="preserve">Create a Palette - </w:t>
+          <w:t>Create a Palette - Coolors</w:t>
         </w:r>
-        <w:proofErr w:type="spellStart"/>
-        <w:r>
-          <w:rPr>
-            <w:rStyle w:val="Hyperlink"/>
-          </w:rPr>
-          <w:t>Coolors</w:t>
-        </w:r>
-        <w:proofErr w:type="spellEnd"/>
       </w:hyperlink>
       <w:r>
         <w:rPr>
@@ -502,7 +458,7 @@
                     <pic:cNvPicPr/>
                   </pic:nvPicPr>
                   <pic:blipFill>
-                    <a:blip r:embed="rId13"/>
+                    <a:blip r:embed="rId12"/>
                     <a:stretch>
                       <a:fillRect/>
                     </a:stretch>
@@ -559,6 +515,9 @@
     </w:p>
     <w:p>
       <w:r>
+        <w:rPr>
+          <w:noProof/>
+        </w:rPr>
         <w:lastRenderedPageBreak/>
         <w:drawing>
           <wp:inline distT="0" distB="0" distL="0" distR="0" wp14:anchorId="0D9B5074" wp14:editId="19FAF7D9">
@@ -576,7 +535,7 @@
                     <pic:cNvPicPr/>
                   </pic:nvPicPr>
                   <pic:blipFill>
-                    <a:blip r:embed="rId14"/>
+                    <a:blip r:embed="rId13"/>
                     <a:stretch>
                       <a:fillRect/>
                     </a:stretch>
@@ -620,7 +579,7 @@
     <w:p>
       <w:r>
         <w:pict w14:anchorId="49B8DE07">
-          <v:rect id="_x0000_i1037" style="width:0;height:1.5pt" o:hralign="center" o:hrstd="t" o:hr="t" fillcolor="#a0a0a0" stroked="f"/>
+          <v:rect id="_x0000_i1025" style="width:0;height:1.5pt" o:hralign="center" o:hrstd="t" o:hr="t" fillcolor="#a0a0a0" stroked="f"/>
         </w:pict>
       </w:r>
     </w:p>
@@ -635,23 +594,7 @@
     </w:p>
     <w:p>
       <w:r>
-        <w:t xml:space="preserve">what is the best AI to create a </w:t>
-      </w:r>
-      <w:proofErr w:type="spellStart"/>
-      <w:r>
-        <w:t>javascript</w:t>
-      </w:r>
-      <w:proofErr w:type="spellEnd"/>
-      <w:r>
-        <w:t xml:space="preserve"> animation for the home page of my website [pasted a project brief for an Investment Decision Journal app — a stock research/portfolio tracking tool with thesis tracking, bull/bear cases, confidence levels, review reminders, and a portfolio dashboard], also mentioned wanting something like an animated blackhole/plasma-ball effect inspired by </w:t>
-      </w:r>
-      <w:proofErr w:type="spellStart"/>
-      <w:r>
-        <w:t>TradingView</w:t>
-      </w:r>
-      <w:proofErr w:type="spellEnd"/>
-      <w:r>
-        <w:t>, and asked what objects could work and which AI is best for it.</w:t>
+        <w:t>what is the best AI to create a javascript animation for the home page of my website [pasted a project brief for an Investment Decision Journal app — a stock research/portfolio tracking tool with thesis tracking, bull/bear cases, confidence levels, review reminders, and a portfolio dashboard], also mentioned wanting something like an animated blackhole/plasma-ball effect inspired by TradingView, and asked what objects could work and which AI is best for it.</w:t>
       </w:r>
     </w:p>
     <w:p>
@@ -690,23 +633,7 @@
     <w:p>
       <w:r>
         <w:lastRenderedPageBreak/>
-        <w:t xml:space="preserve">this is my colour </w:t>
-      </w:r>
-      <w:proofErr w:type="spellStart"/>
-      <w:r>
-        <w:t>palete</w:t>
-      </w:r>
-      <w:proofErr w:type="spellEnd"/>
-      <w:r>
-        <w:t xml:space="preserve">, build me a high detailed design </w:t>
-      </w:r>
-      <w:proofErr w:type="spellStart"/>
-      <w:r>
-        <w:t>i</w:t>
-      </w:r>
-      <w:proofErr w:type="spellEnd"/>
-      <w:r>
-        <w:t xml:space="preserve"> can run in vs code</w:t>
+        <w:t>this is my colour palete, build me a high detailed design i can run in vs code</w:t>
       </w:r>
     </w:p>
     <w:p>
@@ -752,23 +679,7 @@
     </w:p>
     <w:p>
       <w:r>
-        <w:t xml:space="preserve">can </w:t>
-      </w:r>
-      <w:proofErr w:type="spellStart"/>
-      <w:r>
-        <w:t>i</w:t>
-      </w:r>
-      <w:proofErr w:type="spellEnd"/>
-      <w:r>
-        <w:t xml:space="preserve"> get just the code for the animation, none of the website part and can you write me the prompts out that </w:t>
-      </w:r>
-      <w:proofErr w:type="spellStart"/>
-      <w:r>
-        <w:t>i</w:t>
-      </w:r>
-      <w:proofErr w:type="spellEnd"/>
-      <w:r>
-        <w:t xml:space="preserve"> used to get you to make the animation</w:t>
+        <w:t>can i get just the code for the animation, none of the website part and can you write me the prompts out that i used to get you to make the animation</w:t>
       </w:r>
     </w:p>
     <w:p>
@@ -783,7 +694,7 @@
     <w:p>
       <w:r>
         <w:pict w14:anchorId="542A7E98">
-          <v:rect id="_x0000_i1038" style="width:0;height:1.5pt" o:hralign="center" o:hrstd="t" o:hr="t" fillcolor="#a0a0a0" stroked="f"/>
+          <v:rect id="_x0000_i1026" style="width:0;height:1.5pt" o:hralign="center" o:hrstd="t" o:hr="t" fillcolor="#a0a0a0" stroked="f"/>
         </w:pict>
       </w:r>
     </w:p>
@@ -819,23 +730,7 @@
     </w:p>
     <w:p>
       <w:r>
-        <w:t xml:space="preserve">can you re do the decision tree network to make it more realistic and interesting because </w:t>
-      </w:r>
-      <w:proofErr w:type="spellStart"/>
-      <w:r>
-        <w:t>i</w:t>
-      </w:r>
-      <w:proofErr w:type="spellEnd"/>
-      <w:r>
-        <w:t xml:space="preserve"> think </w:t>
-      </w:r>
-      <w:proofErr w:type="spellStart"/>
-      <w:r>
-        <w:t>its</w:t>
-      </w:r>
-      <w:proofErr w:type="spellEnd"/>
-      <w:r>
-        <w:t xml:space="preserve"> really cool but not detailed enough</w:t>
+        <w:t>can you re do the decision tree network to make it more realistic and interesting because i think its really cool but not detailed enough</w:t>
       </w:r>
     </w:p>
     <w:p>
@@ -919,6 +814,347 @@
       </w:pPr>
       <w:r>
         <w:t>A performance pass converting ~86 separate per-node draw calls into 2 instanced meshes</w:t>
+      </w:r>
+    </w:p>
+    <w:p/>
+    <w:p>
+      <w:pPr>
+        <w:rPr>
+          <w:b/>
+          <w:bCs/>
+        </w:rPr>
+      </w:pPr>
+      <w:r>
+        <w:rPr>
+          <w:b/>
+          <w:bCs/>
+          <w:highlight w:val="yellow"/>
+        </w:rPr>
+        <w:t>A criteria stuff:</w:t>
+      </w:r>
+    </w:p>
+    <w:p>
+      <w:r>
+        <w:t>Two relevant implications:</w:t>
+      </w:r>
+    </w:p>
+    <w:p>
+      <w:pPr>
+        <w:pStyle w:val="ListParagraph"/>
+        <w:numPr>
+          <w:ilvl w:val="0"/>
+          <w:numId w:val="2"/>
+        </w:numPr>
+      </w:pPr>
+      <w:r>
+        <w:t>Accessibility. Because my app is designed for all investors its important that people with disabilities can use it. I will design the project with high contrast between text and background, Titles for images for e readers – for the blind, the ability to magnify text, etc.</w:t>
+      </w:r>
+    </w:p>
+    <w:p>
+      <w:pPr>
+        <w:pStyle w:val="ListParagraph"/>
+        <w:numPr>
+          <w:ilvl w:val="0"/>
+          <w:numId w:val="2"/>
+        </w:numPr>
+      </w:pPr>
+      <w:r>
+        <w:t>Privacy. Because making an investment decision journal requires inputting personal monetary decisions which could be considered quite private data its important that users privacy is kept. I will do this by asking for permission for cookies and showing a disclaimer about data I will need to collect, and how it will not be shared.</w:t>
+      </w:r>
+    </w:p>
+    <w:p>
+      <w:pPr>
+        <w:pStyle w:val="ListParagraph"/>
+        <w:rPr>
+          <w:u w:val="single"/>
+        </w:rPr>
+      </w:pPr>
+    </w:p>
+    <w:p>
+      <w:pPr>
+        <w:rPr>
+          <w:b/>
+          <w:bCs/>
+          <w:u w:val="single"/>
+        </w:rPr>
+      </w:pPr>
+      <w:r>
+        <w:rPr>
+          <w:b/>
+          <w:bCs/>
+          <w:highlight w:val="yellow"/>
+          <w:u w:val="single"/>
+        </w:rPr>
+        <w:t>Two methods of project management for planning:</w:t>
+      </w:r>
+    </w:p>
+    <w:p>
+      <w:pPr>
+        <w:pStyle w:val="ListParagraph"/>
+        <w:numPr>
+          <w:ilvl w:val="0"/>
+          <w:numId w:val="2"/>
+        </w:numPr>
+      </w:pPr>
+      <w:hyperlink r:id="rId14" w:history="1">
+        <w:r>
+          <w:rPr>
+            <w:rStyle w:val="Hyperlink"/>
+          </w:rPr>
+          <w:t>https://www.figma.co</w:t>
+        </w:r>
+        <w:r>
+          <w:rPr>
+            <w:rStyle w:val="Hyperlink"/>
+          </w:rPr>
+          <w:t>m</w:t>
+        </w:r>
+        <w:r>
+          <w:rPr>
+            <w:rStyle w:val="Hyperlink"/>
+          </w:rPr>
+          <w:t>/make/DsBcsbG96y2TW2J4hgVnID/Stock-research-app?t=hVCeLNTpkXmkmuug-1</w:t>
+        </w:r>
+      </w:hyperlink>
+    </w:p>
+    <w:p>
+      <w:pPr>
+        <w:pStyle w:val="ListParagraph"/>
+        <w:numPr>
+          <w:ilvl w:val="0"/>
+          <w:numId w:val="2"/>
+        </w:numPr>
+      </w:pPr>
+      <w:hyperlink r:id="rId15" w:history="1">
+        <w:r>
+          <w:rPr>
+            <w:rStyle w:val="Hyperlink"/>
+          </w:rPr>
+          <w:t>Comp Sci | Trello</w:t>
+        </w:r>
+      </w:hyperlink>
+    </w:p>
+    <w:p>
+      <w:r>
+        <w:rPr>
+          <w:noProof/>
+        </w:rPr>
+        <w:drawing>
+          <wp:inline distT="0" distB="0" distL="0" distR="0" wp14:anchorId="1FF7FFBC" wp14:editId="5B4B217C">
+            <wp:extent cx="1829857" cy="1116855"/>
+            <wp:effectExtent l="0" t="0" r="0" b="7620"/>
+            <wp:docPr id="2099634707" name="Picture 1"/>
+            <wp:cNvGraphicFramePr>
+              <a:graphicFrameLocks xmlns:a="http://schemas.openxmlformats.org/drawingml/2006/main" noChangeAspect="1"/>
+            </wp:cNvGraphicFramePr>
+            <a:graphic xmlns:a="http://schemas.openxmlformats.org/drawingml/2006/main">
+              <a:graphicData uri="http://schemas.openxmlformats.org/drawingml/2006/picture">
+                <pic:pic xmlns:pic="http://schemas.openxmlformats.org/drawingml/2006/picture">
+                  <pic:nvPicPr>
+                    <pic:cNvPr id="2099634707" name=""/>
+                    <pic:cNvPicPr/>
+                  </pic:nvPicPr>
+                  <pic:blipFill>
+                    <a:blip r:embed="rId16" cstate="print">
+                      <a:extLst>
+                        <a:ext uri="{28A0092B-C50C-407E-A947-70E740481C1C}">
+                          <a14:useLocalDpi xmlns:a14="http://schemas.microsoft.com/office/drawing/2010/main" val="0"/>
+                        </a:ext>
+                      </a:extLst>
+                    </a:blip>
+                    <a:stretch>
+                      <a:fillRect/>
+                    </a:stretch>
+                  </pic:blipFill>
+                  <pic:spPr>
+                    <a:xfrm>
+                      <a:off x="0" y="0"/>
+                      <a:ext cx="1842884" cy="1124806"/>
+                    </a:xfrm>
+                    <a:prstGeom prst="rect">
+                      <a:avLst/>
+                    </a:prstGeom>
+                  </pic:spPr>
+                </pic:pic>
+              </a:graphicData>
+            </a:graphic>
+          </wp:inline>
+        </w:drawing>
+      </w:r>
+      <w:r>
+        <w:drawing>
+          <wp:inline distT="0" distB="0" distL="0" distR="0" wp14:anchorId="02D892C1" wp14:editId="63660142">
+            <wp:extent cx="2036428" cy="1168234"/>
+            <wp:effectExtent l="0" t="0" r="2540" b="0"/>
+            <wp:docPr id="2078634389" name="Picture 1"/>
+            <wp:cNvGraphicFramePr>
+              <a:graphicFrameLocks xmlns:a="http://schemas.openxmlformats.org/drawingml/2006/main" noChangeAspect="1"/>
+            </wp:cNvGraphicFramePr>
+            <a:graphic xmlns:a="http://schemas.openxmlformats.org/drawingml/2006/main">
+              <a:graphicData uri="http://schemas.openxmlformats.org/drawingml/2006/picture">
+                <pic:pic xmlns:pic="http://schemas.openxmlformats.org/drawingml/2006/picture">
+                  <pic:nvPicPr>
+                    <pic:cNvPr id="2078634389" name=""/>
+                    <pic:cNvPicPr/>
+                  </pic:nvPicPr>
+                  <pic:blipFill>
+                    <a:blip r:embed="rId17" cstate="print">
+                      <a:extLst>
+                        <a:ext uri="{28A0092B-C50C-407E-A947-70E740481C1C}">
+                          <a14:useLocalDpi xmlns:a14="http://schemas.microsoft.com/office/drawing/2010/main" val="0"/>
+                        </a:ext>
+                      </a:extLst>
+                    </a:blip>
+                    <a:stretch>
+                      <a:fillRect/>
+                    </a:stretch>
+                  </pic:blipFill>
+                  <pic:spPr>
+                    <a:xfrm>
+                      <a:off x="0" y="0"/>
+                      <a:ext cx="2042061" cy="1171465"/>
+                    </a:xfrm>
+                    <a:prstGeom prst="rect">
+                      <a:avLst/>
+                    </a:prstGeom>
+                  </pic:spPr>
+                </pic:pic>
+              </a:graphicData>
+            </a:graphic>
+          </wp:inline>
+        </w:drawing>
+      </w:r>
+      <w:r>
+        <w:drawing>
+          <wp:inline distT="0" distB="0" distL="0" distR="0" wp14:anchorId="7D532C13" wp14:editId="3CD5713D">
+            <wp:extent cx="1561949" cy="1180409"/>
+            <wp:effectExtent l="0" t="0" r="635" b="1270"/>
+            <wp:docPr id="389821792" name="Picture 1"/>
+            <wp:cNvGraphicFramePr>
+              <a:graphicFrameLocks xmlns:a="http://schemas.openxmlformats.org/drawingml/2006/main" noChangeAspect="1"/>
+            </wp:cNvGraphicFramePr>
+            <a:graphic xmlns:a="http://schemas.openxmlformats.org/drawingml/2006/main">
+              <a:graphicData uri="http://schemas.openxmlformats.org/drawingml/2006/picture">
+                <pic:pic xmlns:pic="http://schemas.openxmlformats.org/drawingml/2006/picture">
+                  <pic:nvPicPr>
+                    <pic:cNvPr id="389821792" name=""/>
+                    <pic:cNvPicPr/>
+                  </pic:nvPicPr>
+                  <pic:blipFill>
+                    <a:blip r:embed="rId18" cstate="print">
+                      <a:extLst>
+                        <a:ext uri="{28A0092B-C50C-407E-A947-70E740481C1C}">
+                          <a14:useLocalDpi xmlns:a14="http://schemas.microsoft.com/office/drawing/2010/main" val="0"/>
+                        </a:ext>
+                      </a:extLst>
+                    </a:blip>
+                    <a:stretch>
+                      <a:fillRect/>
+                    </a:stretch>
+                  </pic:blipFill>
+                  <pic:spPr>
+                    <a:xfrm>
+                      <a:off x="0" y="0"/>
+                      <a:ext cx="1600357" cy="1209435"/>
+                    </a:xfrm>
+                    <a:prstGeom prst="rect">
+                      <a:avLst/>
+                    </a:prstGeom>
+                  </pic:spPr>
+                </pic:pic>
+              </a:graphicData>
+            </a:graphic>
+          </wp:inline>
+        </w:drawing>
+      </w:r>
+      <w:r>
+        <w:rPr>
+          <w:noProof/>
+        </w:rPr>
+        <w:t xml:space="preserve"> </w:t>
+      </w:r>
+    </w:p>
+    <w:p>
+      <w:r>
+        <w:t>Required component breakdown:</w:t>
+      </w:r>
+    </w:p>
+    <w:p>
+      <w:pPr>
+        <w:pStyle w:val="ListParagraph"/>
+        <w:numPr>
+          <w:ilvl w:val="0"/>
+          <w:numId w:val="2"/>
+        </w:numPr>
+      </w:pPr>
+      <w:r>
+        <w:t>Interesting animation for the background</w:t>
+      </w:r>
+    </w:p>
+    <w:p>
+      <w:pPr>
+        <w:pStyle w:val="ListParagraph"/>
+        <w:numPr>
+          <w:ilvl w:val="0"/>
+          <w:numId w:val="2"/>
+        </w:numPr>
+      </w:pPr>
+      <w:r>
+        <w:t>Ability to input stock holdings by value and share size</w:t>
+      </w:r>
+    </w:p>
+    <w:p>
+      <w:pPr>
+        <w:pStyle w:val="ListParagraph"/>
+        <w:numPr>
+          <w:ilvl w:val="0"/>
+          <w:numId w:val="2"/>
+        </w:numPr>
+      </w:pPr>
+      <w:r>
+        <w:t>A wide variety of stocks to choose from</w:t>
+      </w:r>
+    </w:p>
+    <w:p>
+      <w:pPr>
+        <w:pStyle w:val="ListParagraph"/>
+        <w:numPr>
+          <w:ilvl w:val="0"/>
+          <w:numId w:val="2"/>
+        </w:numPr>
+      </w:pPr>
+      <w:r>
+        <w:lastRenderedPageBreak/>
+        <w:t>Ability to input users own thesis, and record it</w:t>
+      </w:r>
+    </w:p>
+    <w:p>
+      <w:pPr>
+        <w:pStyle w:val="ListParagraph"/>
+        <w:numPr>
+          <w:ilvl w:val="0"/>
+          <w:numId w:val="2"/>
+        </w:numPr>
+      </w:pPr>
+      <w:r>
+        <w:t xml:space="preserve">Ability to send users notifications and set review dates for their thesis </w:t>
+      </w:r>
+    </w:p>
+    <w:p>
+      <w:pPr>
+        <w:pStyle w:val="ListParagraph"/>
+        <w:numPr>
+          <w:ilvl w:val="0"/>
+          <w:numId w:val="2"/>
+        </w:numPr>
+      </w:pPr>
+    </w:p>
+    <w:p>
+      <w:pPr>
+        <w:pStyle w:val="ListParagraph"/>
+      </w:pPr>
+      <w:r>
+        <w:t xml:space="preserve"> </w:t>
       </w:r>
     </w:p>
     <w:p/>

</xml_diff>

<commit_message>
Widgets + navigation bar + dashboard restyling
</commit_message>
<xml_diff>
--- a/Project Brief Doc.docx
+++ b/Project Brief Doc.docx
@@ -1176,6 +1176,13 @@
         <w:t xml:space="preserve">that isn’t really doing anything </w:t>
       </w:r>
     </w:p>
+    <w:p/>
+    <w:p/>
+    <w:p>
+      <w:r>
+        <w:t>My focus point - p</w:t>
+      </w:r>
+    </w:p>
     <w:p>
       <w:pPr>
         <w:pStyle w:val="ListParagraph"/>
@@ -1257,6 +1264,7 @@
         <w:rPr>
           <w:noProof/>
         </w:rPr>
+        <w:lastRenderedPageBreak/>
         <w:drawing>
           <wp:inline distT="0" distB="0" distL="0" distR="0" wp14:anchorId="1FF7FFBC" wp14:editId="5B4B217C">
             <wp:extent cx="1829857" cy="1116855"/>
@@ -1400,7 +1408,6 @@
     </w:p>
     <w:p>
       <w:r>
-        <w:lastRenderedPageBreak/>
         <w:t>Required component breakdown:</w:t>
       </w:r>
     </w:p>

</xml_diff>